<commit_message>
add template – sumary
</commit_message>
<xml_diff>
--- a/template_dogovor_new — Fiz Liz.docx
+++ b/template_dogovor_new — Fiz Liz.docx
@@ -63,7 +63,21 @@
         <w:rPr>
           <w:color w:val="000000"/>
         </w:rPr>
-        <w:t>г. Москва                                                                                                                                  «[[ДЕНЬ]]» [[МЕС_ГОД]]</w:t>
+        <w:t xml:space="preserve">г. Москва                                                                                                                               </w:t>
+      </w:r>
+      <w:proofErr w:type="gramStart"/>
+      <w:r>
+        <w:rPr>
+          <w:color w:val="000000"/>
+        </w:rPr>
+        <w:t xml:space="preserve">   «</w:t>
+      </w:r>
+      <w:proofErr w:type="gramEnd"/>
+      <w:r>
+        <w:rPr>
+          <w:color w:val="000000"/>
+        </w:rPr>
+        <w:t>[[ДЕНЬ]]» [[МЕС_ГОД]]</w:t>
       </w:r>
       <w:r>
         <w:rPr>
@@ -203,7 +217,15 @@
         <w:jc w:val="both"/>
       </w:pPr>
       <w:r>
-        <w:t>1.1. Заказчик поручает, а Исполнитель обязуется оказать услуги по организации и проведению мероприятия в формате командообразующей игры по мотивам телепередач «</w:t>
+        <w:t xml:space="preserve">1.1. Заказчик поручает, а Исполнитель обязуется оказать услуги по организации и проведению мероприятия в формате </w:t>
+      </w:r>
+      <w:proofErr w:type="spellStart"/>
+      <w:r>
+        <w:t>командообразующей</w:t>
+      </w:r>
+      <w:proofErr w:type="spellEnd"/>
+      <w:r>
+        <w:t xml:space="preserve"> игры по мотивам телепередач «</w:t>
       </w:r>
       <w:r>
         <w:rPr>
@@ -1016,7 +1038,29 @@
                       <w:szCs w:val="20"/>
                       <w:shd w:val="clear" w:color="auto" w:fill="FFFFFF"/>
                     </w:rPr>
-                    <w:t>АО «ТБанк»</w:t>
+                    <w:t>АО «</w:t>
+                  </w:r>
+                  <w:proofErr w:type="spellStart"/>
+                  <w:r>
+                    <w:rPr>
+                      <w:rFonts w:ascii="Roboto;Times New Roman" w:hAnsi="Roboto;Times New Roman" w:cs="Roboto;Times New Roman"/>
+                      <w:color w:val="000000"/>
+                      <w:sz w:val="20"/>
+                      <w:szCs w:val="20"/>
+                      <w:shd w:val="clear" w:color="auto" w:fill="FFFFFF"/>
+                    </w:rPr>
+                    <w:t>ТБанк</w:t>
+                  </w:r>
+                  <w:proofErr w:type="spellEnd"/>
+                  <w:r>
+                    <w:rPr>
+                      <w:rFonts w:ascii="Roboto;Times New Roman" w:hAnsi="Roboto;Times New Roman" w:cs="Roboto;Times New Roman"/>
+                      <w:color w:val="000000"/>
+                      <w:sz w:val="20"/>
+                      <w:szCs w:val="20"/>
+                      <w:shd w:val="clear" w:color="auto" w:fill="FFFFFF"/>
+                    </w:rPr>
+                    <w:t>»</w:t>
                   </w:r>
                 </w:p>
               </w:tc>
@@ -1079,9 +1123,11 @@
                   <w:pPr>
                     <w:spacing w:line="240" w:lineRule="atLeast"/>
                   </w:pPr>
+                  <w:proofErr w:type="spellStart"/>
                   <w:r>
                     <w:t>msk@goodnight.show</w:t>
                   </w:r>
+                  <w:proofErr w:type="spellEnd"/>
                 </w:p>
                 <w:p>
                   <w:pPr>
@@ -1542,18 +1588,26 @@
         <w:tc>
           <w:tcPr>
             <w:tcW w:w="5211" w:type="dxa"/>
-            <w:vAlign w:val="bottom"/>
+            <w:vAlign w:val="center"/>
           </w:tcPr>
           <w:p>
+            <w:pPr>
+              <w:jc w:val="right"/>
+            </w:pPr>
             <w:r>
               <w:t xml:space="preserve"> [[ЗАК]]</w:t>
             </w:r>
           </w:p>
-          <w:p/>
+          <w:p>
+            <w:pPr>
+              <w:jc w:val="right"/>
+            </w:pPr>
+          </w:p>
           <w:p>
             <w:pPr>
               <w:pStyle w:val="ad"/>
               <w:ind w:left="0"/>
+              <w:jc w:val="right"/>
               <w:rPr>
                 <w:sz w:val="20"/>
                 <w:szCs w:val="20"/>
@@ -1564,6 +1618,7 @@
             <w:pPr>
               <w:pStyle w:val="ad"/>
               <w:ind w:left="0"/>
+              <w:jc w:val="right"/>
               <w:rPr>
                 <w:sz w:val="20"/>
                 <w:szCs w:val="20"/>

</xml_diff>